<commit_message>
Feature 010 — WiP
</commit_message>
<xml_diff>
--- a/Samples/syntax-showcase.template.docx
+++ b/Samples/syntax-showcase.template.docx
@@ -12,7 +12,16 @@
     </w:p>
     <w:p>
       <w:r>
-        <w:t>Feature 010 demonstration • Source expressions are shown in the left column; the right column is evaluated using the companion JSON.</w:t>
+        <w:t xml:space="preserve">Formatting syntax </w:t>
+      </w:r>
+      <w:r>
+        <w:t>demonstration</w:t>
+      </w:r>
+      <w:r>
+        <w:t>.</w:t>
+      </w:r>
+      <w:r>
+        <w:t xml:space="preserve"> Source expressions are shown in the left column; the right column is evaluated using the companion JSON.</w:t>
       </w:r>
     </w:p>
     <w:p>
@@ -99,14 +108,7 @@
                 <w:b/>
                 <w:bCs/>
               </w:rPr>
-              <w:t>R</w:t>
-            </w:r>
-            <w:r>
-              <w:rPr>
-                <w:b/>
-                <w:bCs/>
-              </w:rPr>
-              <w:t>endered value</w:t>
+              <w:t>Rendered value</w:t>
             </w:r>
           </w:p>
         </w:tc>
@@ -465,9 +467,33 @@
     <w:p>
       <w:pPr>
         <w:pStyle w:val="Caption"/>
+        <w:rPr>
+          <w:color w:val="auto"/>
+        </w:rPr>
+      </w:pPr>
+    </w:p>
+    <w:p>
+      <w:pPr>
+        <w:pStyle w:val="Caption"/>
+        <w:rPr>
+          <w:b w:val="0"/>
+          <w:bCs w:val="0"/>
+          <w:color w:val="auto"/>
+        </w:rPr>
       </w:pPr>
       <w:r>
-        <w:t>Note: Expected number/date formatting assumes MergeOptions.Culture = en-US. The spellout formatter always uses Russian RUB.</w:t>
+        <w:rPr>
+          <w:color w:val="auto"/>
+        </w:rPr>
+        <w:t>Note:</w:t>
+      </w:r>
+      <w:r>
+        <w:rPr>
+          <w:b w:val="0"/>
+          <w:bCs w:val="0"/>
+          <w:color w:val="auto"/>
+        </w:rPr>
+        <w:t xml:space="preserve"> Expected number/date formatting assumes MergeOptions.Culture = en-US. The spellout formatter always uses Russian RUB.</w:t>
       </w:r>
     </w:p>
     <w:p>
@@ -479,6 +505,13 @@
       </w:r>
     </w:p>
     <w:p>
+      <w:r>
+        <w:rPr>
+          <w:b/>
+          <w:bCs/>
+        </w:rPr>
+        <w:t xml:space="preserve">Note: </w:t>
+      </w:r>
       <w:r>
         <w:t>Approved status (true branch / false branch):</w:t>
       </w:r>
@@ -509,6 +542,13 @@
       </w:r>
     </w:p>
     <w:p>
+      <w:r>
+        <w:rPr>
+          <w:b/>
+          <w:bCs/>
+        </w:rPr>
+        <w:t xml:space="preserve">Note: </w:t>
+      </w:r>
       <w:r>
         <w:t>Archive status:</w:t>
       </w:r>
@@ -548,6 +588,13 @@
     </w:p>
     <w:p>
       <w:r>
+        <w:rPr>
+          <w:b/>
+          <w:bCs/>
+        </w:rPr>
+        <w:t xml:space="preserve">Note: </w:t>
+      </w:r>
+      <w:r>
         <w:t xml:space="preserve">The </w:t>
       </w:r>
       <w:r>
@@ -582,6 +629,13 @@
       </w:r>
     </w:p>
     <w:p>
+      <w:r>
+        <w:rPr>
+          <w:b/>
+          <w:bCs/>
+        </w:rPr>
+        <w:t xml:space="preserve">Note: </w:t>
+      </w:r>
       <w:r>
         <w:t>Word list numbering is preserved; restarting numbering per loop is not guaranteed.</w:t>
       </w:r>
@@ -836,6 +890,13 @@
     </w:p>
     <w:p>
       <w:r>
+        <w:rPr>
+          <w:b/>
+          <w:bCs/>
+        </w:rPr>
+        <w:t xml:space="preserve">Note: </w:t>
+      </w:r>
+      <w:r>
         <w:t>Each department repeats its heading; each member repeats a bullet. ../Name accesses the enclosing department.</w:t>
       </w:r>
     </w:p>
@@ -884,8 +945,30 @@
       </w:r>
     </w:p>
     <w:p>
+      <w:bookmarkStart w:id="0" w:name="OLE_LINK1"/>
       <w:r>
-        <w:t>Literal braces: {{Company.Name}}</w:t>
+        <w:rPr>
+          <w:b/>
+          <w:bCs/>
+        </w:rPr>
+        <w:t xml:space="preserve">Note: </w:t>
+      </w:r>
+      <w:bookmarkEnd w:id="0"/>
+      <w:r>
+        <w:t>Double braces escape template expressions, displaying them literally without evaluation. Triple braces evaluate the expression and surround the result with literal braces.</w:t>
+      </w:r>
+    </w:p>
+    <w:p>
+      <w:r>
+        <w:t>Literal braces: {{</w:t>
+      </w:r>
+      <w:proofErr w:type="spellStart"/>
+      <w:r>
+        <w:t>Company.Name</w:t>
+      </w:r>
+      <w:proofErr w:type="spellEnd"/>
+      <w:r>
+        <w:t>}}</w:t>
       </w:r>
     </w:p>
     <w:p>
@@ -902,6 +985,13 @@
       </w:r>
     </w:p>
     <w:p>
+      <w:r>
+        <w:rPr>
+          <w:b/>
+          <w:bCs/>
+        </w:rPr>
+        <w:t xml:space="preserve">Note: </w:t>
+      </w:r>
       <w:r>
         <w:t>Root company from a nested loop:</w:t>
       </w:r>

</xml_diff>